<commit_message>
Regenerate the firmware documentation DOCX and PDF
Render version 1.1 with its diagrams.
</commit_message>
<xml_diff>
--- a/docs/SmartPot_IoT_Documentation.docx
+++ b/docs/SmartPot_IoT_Documentation.docx
@@ -359,7 +359,7 @@
                 <w:sz w:val="19"/>
                 <w:szCs w:val="19"/>
               </w:rPr>
-              <w:t xml:space="preserve">1.0 · septiembre 2026</w:t>
+              <w:t xml:space="preserve">1.1 · octubre 2026</w:t>
             </w:r>
             <w:r>
               <w:rPr>
@@ -729,7 +729,7 @@
                 <w:sz w:val="17"/>
                 <w:szCs w:val="17"/>
               </w:rPr>
-              <w:t xml:space="preserve">1.0 · septiembre 2026</w:t>
+              <w:t xml:space="preserve">1.1 · octubre 2026</w:t>
             </w:r>
           </w:p>
         </w:tc>
@@ -1440,7 +1440,7 @@
       <w:r>
         <w:drawing>
           <wp:inline distT="0" distB="0" distL="0" distR="0">
-            <wp:extent cx="7313949" cy="4318000"/>
+            <wp:extent cx="6163596" cy="4318000"/>
             <wp:docPr id="107" name="SmartPot_IoT_Global_Component"/>
             <wp:cNvGraphicFramePr>
               <a:graphicFrameLocks noChangeAspect="1"/>
@@ -1461,7 +1461,7 @@
                   <pic:spPr>
                     <a:xfrm>
                       <a:off x="0" y="0"/>
-                      <a:ext cx="7313949" cy="4318000"/>
+                      <a:ext cx="6163596" cy="4318000"/>
                     </a:xfrm>
                     <a:prstGeom prst="rect">
                       <a:avLst/>
@@ -2179,7 +2179,7 @@
                 <w:sz w:val="17"/>
                 <w:szCs w:val="17"/>
               </w:rPr>
-              <w:t xml:space="preserve">Luz de cultivo</w:t>
+              <w:t xml:space="preserve">Luz ultravioleta</w:t>
             </w:r>
           </w:p>
         </w:tc>
@@ -2551,7 +2551,7 @@
       <w:r>
         <w:drawing>
           <wp:inline distT="0" distB="0" distL="0" distR="0">
-            <wp:extent cx="3696071" cy="7112000"/>
+            <wp:extent cx="3645122" cy="7112000"/>
             <wp:docPr id="109" name="SmartPot_IoT_01_Main_Loop"/>
             <wp:cNvGraphicFramePr>
               <a:graphicFrameLocks noChangeAspect="1"/>
@@ -2572,7 +2572,7 @@
                   <pic:spPr>
                     <a:xfrm>
                       <a:off x="0" y="0"/>
-                      <a:ext cx="3696071" cy="7112000"/>
+                      <a:ext cx="3645122" cy="7112000"/>
                     </a:xfrm>
                     <a:prstGeom prst="rect">
                       <a:avLst/>
@@ -2965,7 +2965,7 @@
                 <w:sz w:val="17"/>
                 <w:szCs w:val="17"/>
               </w:rPr>
-              <w:t xml:space="preserve">Firmado por la CA propia de SmartPot; el firmware lo verifica con </w:t>
+              <w:t xml:space="preserve">Firmado por la CA propia de SmartPot; el firmware lo verifica con la CA pública que trae </w:t>
             </w:r>
             <w:r>
               <w:rPr>
@@ -2974,7 +2974,24 @@
                 <w:sz w:val="15"/>
                 <w:szCs w:val="15"/>
               </w:rPr>
-              <w:t xml:space="preserve">ca.crt</w:t>
+              <w:t xml:space="preserve">config.py</w:t>
+            </w:r>
+            <w:r>
+              <w:rPr>
+                <w:color w:val="17261F"/>
+                <w:sz w:val="17"/>
+                <w:szCs w:val="17"/>
+              </w:rPr>
+              <w:t xml:space="preserve"> en </w:t>
+            </w:r>
+            <w:r>
+              <w:rPr>
+                <w:rFonts w:ascii="JetBrains Mono" w:hAnsi="JetBrains Mono" w:eastAsia="JetBrains Mono" w:cs="JetBrains Mono"/>
+                <w:color w:val="0A5A3C"/>
+                <w:sz w:val="15"/>
+                <w:szCs w:val="15"/>
+              </w:rPr>
+              <w:t xml:space="preserve">BROKER["CA_CRT"]</w:t>
             </w:r>
           </w:p>
         </w:tc>
@@ -3467,7 +3484,7 @@
           <w:sz w:val="20"/>
           <w:szCs w:val="20"/>
         </w:rPr>
-        <w:t xml:space="preserve">) y el bloque </w:t>
+        <w:t xml:space="preserve">), el bloque </w:t>
       </w:r>
       <w:r>
         <w:rPr>
@@ -3484,7 +3501,24 @@
           <w:sz w:val="20"/>
           <w:szCs w:val="20"/>
         </w:rPr>
-        <w:t xml:space="preserve"> del cultivo. </w:t>
+        <w:t xml:space="preserve"> del cultivo y el bloque </w:t>
+      </w:r>
+      <w:r>
+        <w:rPr>
+          <w:rFonts w:ascii="JetBrains Mono" w:hAnsi="JetBrains Mono" w:eastAsia="JetBrains Mono" w:cs="JetBrains Mono"/>
+          <w:color w:val="0A5A3C"/>
+          <w:sz w:val="18"/>
+          <w:szCs w:val="18"/>
+        </w:rPr>
+        <w:t xml:space="preserve">BROKER</w:t>
+      </w:r>
+      <w:r>
+        <w:rPr>
+          <w:color w:val="17261F"/>
+          <w:sz w:val="20"/>
+          <w:szCs w:val="20"/>
+        </w:rPr>
+        <w:t xml:space="preserve"> con la CA del broker. </w:t>
       </w:r>
       <w:r>
         <w:rPr>
@@ -3549,8 +3583,8 @@
         <w:tblLook w:val="04A0" w:firstRow="1" w:firstColumn="1" w:noVBand="1"/>
       </w:tblPr>
       <w:tblGrid>
-        <w:gridCol w:w="4261"/>
-        <w:gridCol w:w="5099"/>
+        <w:gridCol w:w="2809"/>
+        <w:gridCol w:w="6551"/>
       </w:tblGrid>
       <w:tr>
         <w:trPr>
@@ -3559,7 +3593,7 @@
         </w:trPr>
         <w:tc>
           <w:tcPr>
-            <w:tcW w:w="4261" w:type="dxa"/>
+            <w:tcW w:w="2809" w:type="dxa"/>
             <w:shd w:val="clear" w:color="auto" w:fill="0B3D2B"/>
             <w:tcMar>
               <w:top w:w="70" w:type="dxa"/>
@@ -3588,7 +3622,7 @@
         </w:tc>
         <w:tc>
           <w:tcPr>
-            <w:tcW w:w="5099" w:type="dxa"/>
+            <w:tcW w:w="6551" w:type="dxa"/>
             <w:shd w:val="clear" w:color="auto" w:fill="0B3D2B"/>
             <w:tcMar>
               <w:top w:w="70" w:type="dxa"/>
@@ -3622,7 +3656,7 @@
         </w:trPr>
         <w:tc>
           <w:tcPr>
-            <w:tcW w:w="4261" w:type="dxa"/>
+            <w:tcW w:w="2809" w:type="dxa"/>
             <w:shd w:val="clear" w:color="auto" w:fill="FFFFFF"/>
             <w:tcMar>
               <w:top w:w="70" w:type="dxa"/>
@@ -3672,7 +3706,7 @@
         </w:tc>
         <w:tc>
           <w:tcPr>
-            <w:tcW w:w="5099" w:type="dxa"/>
+            <w:tcW w:w="6551" w:type="dxa"/>
             <w:shd w:val="clear" w:color="auto" w:fill="FFFFFF"/>
             <w:tcMar>
               <w:top w:w="70" w:type="dxa"/>
@@ -3703,7 +3737,7 @@
         </w:trPr>
         <w:tc>
           <w:tcPr>
-            <w:tcW w:w="4261" w:type="dxa"/>
+            <w:tcW w:w="2809" w:type="dxa"/>
             <w:shd w:val="clear" w:color="auto" w:fill="F2F7F4"/>
             <w:tcMar>
               <w:top w:w="70" w:type="dxa"/>
@@ -3753,7 +3787,7 @@
         </w:tc>
         <w:tc>
           <w:tcPr>
-            <w:tcW w:w="5099" w:type="dxa"/>
+            <w:tcW w:w="6551" w:type="dxa"/>
             <w:shd w:val="clear" w:color="auto" w:fill="F2F7F4"/>
             <w:tcMar>
               <w:top w:w="70" w:type="dxa"/>
@@ -3784,7 +3818,7 @@
         </w:trPr>
         <w:tc>
           <w:tcPr>
-            <w:tcW w:w="4261" w:type="dxa"/>
+            <w:tcW w:w="2809" w:type="dxa"/>
             <w:shd w:val="clear" w:color="auto" w:fill="FFFFFF"/>
             <w:tcMar>
               <w:top w:w="70" w:type="dxa"/>
@@ -3851,32 +3885,11 @@
               </w:rPr>
               <w:t xml:space="preserve">tls</w:t>
             </w:r>
-            <w:r>
-              <w:rPr>
-                <w:b/>
-                <w:bCs/>
-                <w:color w:val="0A5A3C"/>
-                <w:sz w:val="17"/>
-                <w:szCs w:val="17"/>
-              </w:rPr>
-              <w:t xml:space="preserve">, </w:t>
-            </w:r>
-            <w:r>
-              <w:rPr>
-                <w:rFonts w:ascii="JetBrains Mono" w:hAnsi="JetBrains Mono" w:eastAsia="JetBrains Mono" w:cs="JetBrains Mono"/>
-                <w:b/>
-                <w:bCs/>
-                <w:color w:val="0A5A3C"/>
-                <w:sz w:val="15"/>
-                <w:szCs w:val="15"/>
-              </w:rPr>
-              <w:t xml:space="preserve">ca_file</w:t>
-            </w:r>
-          </w:p>
-        </w:tc>
-        <w:tc>
-          <w:tcPr>
-            <w:tcW w:w="5099" w:type="dxa"/>
+          </w:p>
+        </w:tc>
+        <w:tc>
+          <w:tcPr>
+            <w:tcW w:w="6551" w:type="dxa"/>
             <w:shd w:val="clear" w:color="auto" w:fill="FFFFFF"/>
             <w:tcMar>
               <w:top w:w="70" w:type="dxa"/>
@@ -3896,7 +3909,7 @@
                 <w:sz w:val="17"/>
                 <w:szCs w:val="17"/>
               </w:rPr>
-              <w:t xml:space="preserve">Broker y verificación del certificado</w:t>
+              <w:t xml:space="preserve">Broker y uso de TLS</w:t>
             </w:r>
           </w:p>
         </w:tc>
@@ -3907,7 +3920,7 @@
         </w:trPr>
         <w:tc>
           <w:tcPr>
-            <w:tcW w:w="4261" w:type="dxa"/>
+            <w:tcW w:w="2809" w:type="dxa"/>
             <w:shd w:val="clear" w:color="auto" w:fill="F2F7F4"/>
             <w:tcMar>
               <w:top w:w="70" w:type="dxa"/>
@@ -3930,14 +3943,74 @@
                 <w:sz w:val="15"/>
                 <w:szCs w:val="15"/>
               </w:rPr>
+              <w:t xml:space="preserve">BROKER.CA_CRT</w:t>
+            </w:r>
+          </w:p>
+        </w:tc>
+        <w:tc>
+          <w:tcPr>
+            <w:tcW w:w="6551" w:type="dxa"/>
+            <w:shd w:val="clear" w:color="auto" w:fill="F2F7F4"/>
+            <w:tcMar>
+              <w:top w:w="70" w:type="dxa"/>
+              <w:left w:w="110" w:type="dxa"/>
+              <w:bottom w:w="70" w:type="dxa"/>
+              <w:right w:w="110" w:type="dxa"/>
+            </w:tcMar>
+            <w:vAlign w:val="center"/>
+          </w:tcPr>
+          <w:p>
+            <w:pPr>
+              <w:spacing w:before="0" w:after="0" w:line="252" w:lineRule="auto"/>
+            </w:pPr>
+            <w:r>
+              <w:rPr>
+                <w:color w:val="17261F"/>
+                <w:sz w:val="17"/>
+                <w:szCs w:val="17"/>
+              </w:rPr>
+              <w:t xml:space="preserve">CA pública de SmartPot en PEM; con ella el firmware verifica el certificado del broker</w:t>
+            </w:r>
+          </w:p>
+        </w:tc>
+      </w:tr>
+      <w:tr>
+        <w:trPr>
+          <w:cantSplit/>
+        </w:trPr>
+        <w:tc>
+          <w:tcPr>
+            <w:tcW w:w="2809" w:type="dxa"/>
+            <w:shd w:val="clear" w:color="auto" w:fill="FFFFFF"/>
+            <w:tcMar>
+              <w:top w:w="70" w:type="dxa"/>
+              <w:left w:w="110" w:type="dxa"/>
+              <w:bottom w:w="70" w:type="dxa"/>
+              <w:right w:w="110" w:type="dxa"/>
+            </w:tcMar>
+            <w:vAlign w:val="center"/>
+          </w:tcPr>
+          <w:p>
+            <w:pPr>
+              <w:spacing w:before="0" w:after="0" w:line="252" w:lineRule="auto"/>
+            </w:pPr>
+            <w:r>
+              <w:rPr>
+                <w:rFonts w:ascii="JetBrains Mono" w:hAnsi="JetBrains Mono" w:eastAsia="JetBrains Mono" w:cs="JetBrains Mono"/>
+                <w:b/>
+                <w:bCs/>
+                <w:color w:val="0A5A3C"/>
+                <w:sz w:val="15"/>
+                <w:szCs w:val="15"/>
+              </w:rPr>
               <w:t xml:space="preserve">SMARTPOT.interval_seconds</w:t>
             </w:r>
           </w:p>
         </w:tc>
         <w:tc>
           <w:tcPr>
-            <w:tcW w:w="5099" w:type="dxa"/>
-            <w:shd w:val="clear" w:color="auto" w:fill="F2F7F4"/>
+            <w:tcW w:w="6551" w:type="dxa"/>
+            <w:shd w:val="clear" w:color="auto" w:fill="FFFFFF"/>
             <w:tcMar>
               <w:top w:w="70" w:type="dxa"/>
               <w:left w:w="110" w:type="dxa"/>
@@ -4040,7 +4113,7 @@
           <w:sz w:val="20"/>
           <w:szCs w:val="20"/>
         </w:rPr>
-        <w:t xml:space="preserve">: 13 pruebas con CPython y módulos de MicroPython simulados sobre el contrato MQTT, los comandos y su ACK, el apagado por tiempo de los actuadores, la escala de los sensores y el respaldo de TLS en versiones anteriores de MicroPython.</w:t>
+        <w:t xml:space="preserve">: 15 pruebas con CPython y módulos de MicroPython simulados sobre el contrato MQTT, los comandos y su ACK (con la duración en segundos, minutos u horas), el apagado por tiempo de los actuadores, la escala de los sensores, la verificación del broker con la CA de la plantilla y el respaldo de TLS en versiones anteriores de MicroPython.</w:t>
       </w:r>
     </w:p>
     <w:p>
@@ -4260,7 +4333,7 @@
                 <w:sz w:val="17"/>
                 <w:szCs w:val="17"/>
               </w:rPr>
-              <w:t xml:space="preserve">, agrega </w:t>
+              <w:t xml:space="preserve">, agrega tu </w:t>
             </w:r>
             <w:r>
               <w:rPr>
@@ -4277,24 +4350,7 @@
                 <w:sz w:val="17"/>
                 <w:szCs w:val="17"/>
               </w:rPr>
-              <w:t xml:space="preserve"> y </w:t>
-            </w:r>
-            <w:r>
-              <w:rPr>
-                <w:rFonts w:ascii="JetBrains Mono" w:hAnsi="JetBrains Mono" w:eastAsia="JetBrains Mono" w:cs="JetBrains Mono"/>
-                <w:color w:val="0A5A3C"/>
-                <w:sz w:val="15"/>
-                <w:szCs w:val="15"/>
-              </w:rPr>
-              <w:t xml:space="preserve">ca.crt</w:t>
-            </w:r>
-            <w:r>
-              <w:rPr>
-                <w:color w:val="17261F"/>
-                <w:sz w:val="17"/>
-                <w:szCs w:val="17"/>
-              </w:rPr>
-              <w:t xml:space="preserve"> y enciende</w:t>
+              <w:t xml:space="preserve"> (ya trae la CA) y enciende</w:t>
             </w:r>
           </w:p>
         </w:tc>
@@ -4353,7 +4409,7 @@
                 <w:sz w:val="17"/>
                 <w:szCs w:val="17"/>
               </w:rPr>
-              <w:t xml:space="preserve">Abre el proyecto, pega </w:t>
+              <w:t xml:space="preserve">Abre el proyecto, pega tu </w:t>
             </w:r>
             <w:r>
               <w:rPr>
@@ -4363,23 +4419,6 @@
                 <w:szCs w:val="15"/>
               </w:rPr>
               <w:t xml:space="preserve">config.py</w:t>
-            </w:r>
-            <w:r>
-              <w:rPr>
-                <w:color w:val="17261F"/>
-                <w:sz w:val="17"/>
-                <w:szCs w:val="17"/>
-              </w:rPr>
-              <w:t xml:space="preserve"> y </w:t>
-            </w:r>
-            <w:r>
-              <w:rPr>
-                <w:rFonts w:ascii="JetBrains Mono" w:hAnsi="JetBrains Mono" w:eastAsia="JetBrains Mono" w:cs="JetBrains Mono"/>
-                <w:color w:val="0A5A3C"/>
-                <w:sz w:val="15"/>
-                <w:szCs w:val="15"/>
-              </w:rPr>
-              <w:t xml:space="preserve">ca.crt</w:t>
             </w:r>
             <w:r>
               <w:rPr>
@@ -4690,7 +4729,7 @@
               <w:sz w:val="14"/>
               <w:szCs w:val="14"/>
             </w:rPr>
-            <w:t xml:space="preserve">SMARTPOT-IOT · V1.0</w:t>
+            <w:t xml:space="preserve">SMARTPOT-IOT · V1.1</w:t>
           </w:r>
         </w:p>
       </w:tc>

</xml_diff>